<commit_message>
auto: push changes 11-06-Thu_19-34-45
</commit_message>
<xml_diff>
--- a/Generateur Des Factures/Factures/Facture numéro 6-2026.docx
+++ b/Generateur Des Factures/Factures/Facture numéro 6-2026.docx
@@ -112,7 +112,7 @@
                 <w:szCs w:val="24"/>
                 <w:lang w:val="fr-FR" w:eastAsia="fr-MA"/>
               </w:rPr>
-              <w:t>Date : 09/06/2026</w:t>
+              <w:t>Date : 11/06/2026</w:t>
             </w:r>
             <w:proofErr w:type="spellStart"/>
             <w:proofErr w:type="spellEnd"/>
@@ -277,7 +277,7 @@
                 <w:sz w:val="28"/>
                 <w:szCs w:val="28"/>
               </w:rPr>
-              <w:t>EVIX Management</w:t>
+              <w:t>Evix management</w:t>
             </w:r>
             <w:proofErr w:type="spellStart"/>
             <w:proofErr w:type="spellEnd"/>
@@ -363,7 +363,7 @@
                 <w:szCs w:val="24"/>
                 <w:lang w:val="fr-FR"/>
               </w:rPr>
-              <w:t>TARIK IBN ZIAD, RES. SMESI IMM.L N° 8, TEMARA</w:t>
+              <w:t>Rue tafetacht spaces la rocade Rabat</w:t>
             </w:r>
             <w:proofErr w:type="spellStart"/>
             <w:proofErr w:type="spellEnd"/>
@@ -396,7 +396,7 @@
                 <w:kern w:val="24"/>
                 <w:lang w:val="fr-FR"/>
               </w:rPr>
-              <w:t>ICE : 00155G2GG000031</w:t>
+              <w:t>ICE : 001559299000031</w:t>
             </w:r>
             <w:proofErr w:type="spellStart"/>
             <w:proofErr w:type="spellEnd"/>

</xml_diff>